<commit_message>
Idle sign-out, mapping-profile choice, Analyst risk report, release notes (D-207-D-209)
- D-209: Idle Timeout signs people out. The SPA signs out after the
  timeout with no activity in any tab ("signed out because you weren't
  active"); IdleSessionValidator refuses idle OIDC/SAML cookie sessions
  on the server too, so a closed tab's session ends. 5-720 minutes.
  Proven live: an idle SAML session with no tab open was refused.
- D-207: no mapping profile chosen means the template's own columns (it
  silently used the oldest active profile). The Targets and Access
  Groups Bulk Actions pages get a Mapping profile choice.
- D-208: script 10 grants ViewRiskReport to the Analyst role.
- Release notes: User_Docs/Release_Notes.md (and Release_Notes.docx)
  with an Unreleased section and 1.0.0; CLAUDE.md now asks for a line
  under Unreleased with every user-visible change.
- Guides updated for all of it; both findings closed.

Co-Authored-By: Claude Opus 5.5 <noreply@anthropic.com>
</commit_message>
<xml_diff>
--- a/Published_Docs/Administrator_Settings_Guide.docx
+++ b/Published_Docs/Administrator_Settings_Guide.docx
@@ -307,7 +307,7 @@
           </w:tcPr>
           <w:p>
             <w:r>
-              <w:t>How long a user's cached rights last without activity. After that, BlueTrack works out their roles again and records a new Logon event.</w:t>
+              <w:t>Signs a user out after this many minutes without activity in any BlueTrack tab. OIDC and SAML sessions also end on the server after this long without a request, even if the tab was closed.</w:t>
             </w:r>
           </w:p>
         </w:tc>
@@ -327,17 +327,17 @@
           </w:tcPr>
           <w:p>
             <w:r>
-              <w:t>15</w:t>
-            </w:r>
-          </w:p>
-        </w:tc>
-        <w:tc>
-          <w:tcPr>
-            <w:tcW w:type="dxa" w:w="1728"/>
-          </w:tcPr>
-          <w:p>
-            <w:r>
-              <w:t>Cached rights expire after 15 minutes regardless (see below), so values above 15 make no practical difference.</w:t>
+              <w:t>15 to 30</w:t>
+            </w:r>
+          </w:p>
+        </w:tc>
+        <w:tc>
+          <w:tcPr>
+            <w:tcW w:type="dxa" w:w="1728"/>
+          </w:tcPr>
+          <w:p>
+            <w:r>
+              <w:t>Short enough that an unattended screen doesn't stay signed in to privileged-access data, long enough not to interrupt normal work. Allowed: 5 to 720.</w:t>
             </w:r>
           </w:p>
         </w:tc>
@@ -663,7 +663,7 @@
         <w:t>Idle timeout.</w:t>
       </w:r>
       <w:r>
-        <w:t xml:space="preserve"> This setting does not sign anyone out. It controls how long BlueTrack keeps a user's roles and permissions in its cache between requests. Cached rights also expire 15 minutes after they were worked out, even for an active user, and any change to a role, group mapping or identity provider clears every user's cache. An OIDC sign-in is held by a session cookie that lasts 8 hours; that lifetime is fixed and is not changed by this setting. There is no range check, so always enter a positive number of minutes.</w:t>
+        <w:t xml:space="preserve"> In the browser, BlueTrack signs the user out after this many minutes with no mouse, keyboard or touch activity in any of its tabs, and the sign-in page says why. OIDC and SAML sessions are also ended on the server once no request has arrived for this long, so a closed tab doesn't leave a usable session behind; each OIDC session also ends after 8 hours regardless. Windows sign-in has no session to end: if Windows Integrated is the default method, the user is signed in again as soon as they leave the sign-in page. Separately, a user's cached roles and permissions last at most 15 minutes, and any change to a role, group mapping or identity provider clears every user's cache.</w:t>
       </w:r>
     </w:p>
     <w:p>
@@ -4335,7 +4335,7 @@
           </w:tcPr>
           <w:p>
             <w:r>
-              <w:t>Admin</w:t>
+              <w:t>Admin, Analyst</w:t>
             </w:r>
           </w:p>
         </w:tc>
@@ -7862,17 +7862,17 @@
           </w:tcPr>
           <w:p>
             <w:r>
-              <w:t>Choose the profile explicitly when the file isn't in template format</w:t>
-            </w:r>
-          </w:p>
-        </w:tc>
-        <w:tc>
-          <w:tcPr>
-            <w:tcW w:type="dxa" w:w="1728"/>
-          </w:tcPr>
-          <w:p>
-            <w:r>
-              <w:t>With None, the import uses the oldest active profile for that import type, if there is one, otherwise the template's own column names. Choosing one avoids surprises.</w:t>
+              <w:t>Choose the profile when the file isn't in template format</w:t>
+            </w:r>
+          </w:p>
+        </w:tc>
+        <w:tc>
+          <w:tcPr>
+            <w:tcW w:type="dxa" w:w="1728"/>
+          </w:tcPr>
+          <w:p>
+            <w:r>
+              <w:t>None means the file uses the template's own column names.</w:t>
             </w:r>
           </w:p>
         </w:tc>
@@ -8368,7 +8368,7 @@
           </w:tcPr>
           <w:p>
             <w:r>
-              <w:t>Whether the profile may be used.</w:t>
+              <w:t>Whether the profile is offered when a data feed or a Bulk Actions upload chooses a profile.</w:t>
             </w:r>
           </w:p>
         </w:tc>
@@ -8388,17 +8388,17 @@
           </w:tcPr>
           <w:p>
             <w:r>
-              <w:t>One active profile per feed type</w:t>
-            </w:r>
-          </w:p>
-        </w:tc>
-        <w:tc>
-          <w:tcPr>
-            <w:tcW w:type="dxa" w:w="1728"/>
-          </w:tcPr>
-          <w:p>
-            <w:r>
-              <w:t>When no profile is chosen, the oldest active one is used. Several active profiles make it unclear which applies.</w:t>
+              <w:t>On for the profiles in use</w:t>
+            </w:r>
+          </w:p>
+        </w:tc>
+        <w:tc>
+          <w:tcPr>
+            <w:tcW w:type="dxa" w:w="1728"/>
+          </w:tcPr>
+          <w:p>
+            <w:r>
+              <w:t>A profile is used only when it's chosen; none chosen means the template's own column names.</w:t>
             </w:r>
           </w:p>
         </w:tc>

</xml_diff>